<commit_message>
Manuscript: regular reading layout (no line numbers, 1.15 spacing)
Removes the review-style line numbers, double spacing and page breaks: 11 pages instead of 17. Text, tables, figures and references are unchanged (verify_manuscript.py: 81/81). The readiness report notes the layout change and the completed submission steps.

Co-Authored-By: Claude Opus 5.5 <noreply@anthropic.com>
Claude-Session: https://claude.ai/code/session_0155iBrnmuAydeLu6YXafvUL
</commit_message>
<xml_diff>
--- a/paper/Manuscript.docx
+++ b/paper/Manuscript.docx
@@ -4,7 +4,7 @@
   <w:body>
     <w:p>
       <w:pPr>
-        <w:spacing w:after="240" w:line="360"/>
+        <w:spacing w:after="160" w:line="312"/>
         <w:jc w:val="center"/>
       </w:pPr>
       <w:r>
@@ -12,15 +12,15 @@
           <w:rFonts w:ascii="Times New Roman" w:cs="Times New Roman" w:eastAsia="Times New Roman" w:hAnsi="Times New Roman"/>
           <w:b/>
           <w:bCs/>
-          <w:sz w:val="28"/>
-          <w:szCs w:val="28"/>
+          <w:sz w:val="32"/>
+          <w:szCs w:val="32"/>
         </w:rPr>
         <w:t xml:space="preserve">Aligning cybersecurity investment with business-impact risk: A knowledge-based AI decision-support model evaluated on real-world incident data</w:t>
       </w:r>
     </w:p>
     <w:p>
       <w:pPr>
-        <w:spacing w:after="240" w:line="360"/>
+        <w:spacing w:after="120" w:line="264"/>
         <w:jc w:val="center"/>
       </w:pPr>
       <w:r>
@@ -36,7 +36,7 @@
     </w:p>
     <w:p>
       <w:pPr>
-        <w:spacing w:after="120" w:line="360"/>
+        <w:spacing w:after="40" w:line="264"/>
         <w:jc w:val="center"/>
       </w:pPr>
       <w:r>
@@ -59,7 +59,7 @@
     </w:p>
     <w:p>
       <w:pPr>
-        <w:spacing w:after="360" w:line="360"/>
+        <w:spacing w:after="40" w:line="264"/>
         <w:jc w:val="center"/>
       </w:pPr>
       <w:r>
@@ -86,7 +86,8 @@
     </w:p>
     <w:p>
       <w:pPr>
-        <w:spacing w:line="360"/>
+        <w:spacing w:after="240" w:line="264"/>
+        <w:jc w:val="center"/>
       </w:pPr>
       <w:r>
         <w:rPr>
@@ -107,15 +108,10 @@
       </w:r>
     </w:p>
     <w:p>
-      <w:r>
-        <w:br w:type="page"/>
-      </w:r>
-    </w:p>
-    <w:p>
       <w:pPr>
         <w:pStyle w:val="Heading1"/>
         <w:keepNext/>
-        <w:spacing w:after="0" w:before="240" w:line="480"/>
+        <w:spacing w:after="80" w:before="240" w:line="276"/>
       </w:pPr>
       <w:r>
         <w:rPr>
@@ -133,7 +129,7 @@
     <w:p>
       <w:pPr>
         <w:keepNext w:val="false"/>
-        <w:spacing w:after="0" w:before="0" w:line="480"/>
+        <w:spacing w:after="120" w:before="0" w:line="276"/>
         <w:jc w:val="both"/>
       </w:pPr>
       <w:r>
@@ -148,7 +144,7 @@
     <w:p>
       <w:pPr>
         <w:keepNext w:val="false"/>
-        <w:spacing w:after="0" w:before="120" w:line="480"/>
+        <w:spacing w:after="200" w:before="0" w:line="276"/>
         <w:jc w:val="both"/>
       </w:pPr>
       <w:r>
@@ -171,15 +167,10 @@
       </w:r>
     </w:p>
     <w:p>
-      <w:r>
-        <w:br w:type="page"/>
-      </w:r>
-    </w:p>
-    <w:p>
       <w:pPr>
         <w:pStyle w:val="Heading1"/>
         <w:keepNext/>
-        <w:spacing w:after="0" w:before="240" w:line="480"/>
+        <w:spacing w:after="80" w:before="240" w:line="276"/>
       </w:pPr>
       <w:r>
         <w:rPr>
@@ -197,8 +188,7 @@
     <w:p>
       <w:pPr>
         <w:keepNext w:val="false"/>
-        <w:spacing w:after="0" w:before="0" w:line="480"/>
-        <w:ind w:firstLine="360"/>
+        <w:spacing w:after="120" w:before="0" w:line="276"/>
         <w:jc w:val="both"/>
       </w:pPr>
       <w:r>
@@ -213,8 +203,7 @@
     <w:p>
       <w:pPr>
         <w:keepNext w:val="false"/>
-        <w:spacing w:after="0" w:before="0" w:line="480"/>
-        <w:ind w:firstLine="360"/>
+        <w:spacing w:after="120" w:before="0" w:line="276"/>
         <w:jc w:val="both"/>
       </w:pPr>
       <w:r>
@@ -229,8 +218,7 @@
     <w:p>
       <w:pPr>
         <w:keepNext w:val="false"/>
-        <w:spacing w:after="0" w:before="0" w:line="480"/>
-        <w:ind w:firstLine="360"/>
+        <w:spacing w:after="120" w:before="0" w:line="276"/>
         <w:jc w:val="both"/>
       </w:pPr>
       <w:r>
@@ -246,7 +234,7 @@
       <w:pPr>
         <w:pStyle w:val="Heading1"/>
         <w:keepNext/>
-        <w:spacing w:after="0" w:before="240" w:line="480"/>
+        <w:spacing w:after="80" w:before="240" w:line="276"/>
       </w:pPr>
       <w:r>
         <w:rPr>
@@ -265,7 +253,7 @@
       <w:pPr>
         <w:pStyle w:val="Heading2"/>
         <w:keepNext/>
-        <w:spacing w:after="0" w:before="120" w:line="480"/>
+        <w:spacing w:after="80" w:before="160" w:line="276"/>
       </w:pPr>
       <w:r>
         <w:rPr>
@@ -283,8 +271,7 @@
     <w:p>
       <w:pPr>
         <w:keepNext/>
-        <w:spacing w:after="0" w:before="0" w:line="480"/>
-        <w:ind w:firstLine="360"/>
+        <w:spacing w:after="120" w:before="0" w:line="276"/>
         <w:jc w:val="both"/>
       </w:pPr>
       <w:r>
@@ -401,7 +388,7 @@
           <w:tab w:val="center" w:pos="4680"/>
           <w:tab w:val="right" w:pos="9360"/>
         </w:tabs>
-        <w:spacing w:after="160" w:before="160" w:line="240" w:lineRule="auto"/>
+        <w:spacing w:after="120" w:before="40" w:line="240" w:lineRule="auto"/>
       </w:pPr>
       <w:r>
         <w:rPr>
@@ -485,7 +472,7 @@
     <w:p>
       <w:pPr>
         <w:keepNext/>
-        <w:spacing w:after="0" w:before="0" w:line="480"/>
+        <w:spacing w:after="120" w:before="0" w:line="276"/>
         <w:jc w:val="both"/>
       </w:pPr>
       <w:r>
@@ -701,7 +688,7 @@
           <w:tab w:val="center" w:pos="4680"/>
           <w:tab w:val="right" w:pos="9360"/>
         </w:tabs>
-        <w:spacing w:after="160" w:before="160" w:line="240" w:lineRule="auto"/>
+        <w:spacing w:after="120" w:before="40" w:line="240" w:lineRule="auto"/>
       </w:pPr>
       <w:r>
         <w:rPr>
@@ -790,7 +777,7 @@
           <w:tab w:val="center" w:pos="4680"/>
           <w:tab w:val="right" w:pos="9360"/>
         </w:tabs>
-        <w:spacing w:after="160" w:before="160" w:line="240" w:lineRule="auto"/>
+        <w:spacing w:after="120" w:before="40" w:line="240" w:lineRule="auto"/>
       </w:pPr>
       <w:r>
         <w:rPr>
@@ -954,7 +941,7 @@
     <w:p>
       <w:pPr>
         <w:keepNext/>
-        <w:spacing w:after="0" w:before="0" w:line="480"/>
+        <w:spacing w:after="120" w:before="0" w:line="276"/>
         <w:jc w:val="both"/>
       </w:pPr>
       <w:r>
@@ -1071,7 +1058,7 @@
           <w:tab w:val="center" w:pos="4680"/>
           <w:tab w:val="right" w:pos="9360"/>
         </w:tabs>
-        <w:spacing w:after="160" w:before="160" w:line="240" w:lineRule="auto"/>
+        <w:spacing w:after="120" w:before="40" w:line="240" w:lineRule="auto"/>
       </w:pPr>
       <w:r>
         <w:rPr>
@@ -1194,7 +1181,7 @@
     <w:p>
       <w:pPr>
         <w:keepNext w:val="false"/>
-        <w:spacing w:after="0" w:before="0" w:line="480"/>
+        <w:spacing w:after="120" w:before="0" w:line="276"/>
         <w:jc w:val="both"/>
       </w:pPr>
       <w:r>
@@ -1210,7 +1197,7 @@
       <w:pPr>
         <w:pStyle w:val="Heading2"/>
         <w:keepNext/>
-        <w:spacing w:after="0" w:before="120" w:line="480"/>
+        <w:spacing w:after="80" w:before="160" w:line="276"/>
       </w:pPr>
       <w:r>
         <w:rPr>
@@ -1228,8 +1215,7 @@
     <w:p>
       <w:pPr>
         <w:keepNext w:val="false"/>
-        <w:spacing w:after="0" w:before="0" w:line="480"/>
-        <w:ind w:firstLine="360"/>
+        <w:spacing w:after="120" w:before="0" w:line="276"/>
         <w:jc w:val="both"/>
       </w:pPr>
       <w:r>
@@ -1333,8 +1319,7 @@
     <w:p>
       <w:pPr>
         <w:keepNext w:val="false"/>
-        <w:spacing w:after="0" w:before="0" w:line="480"/>
-        <w:ind w:firstLine="360"/>
+        <w:spacing w:after="120" w:before="0" w:line="276"/>
         <w:jc w:val="both"/>
       </w:pPr>
       <w:r>
@@ -1539,7 +1524,7 @@
       <w:pPr>
         <w:pStyle w:val="Heading2"/>
         <w:keepNext/>
-        <w:spacing w:after="0" w:before="120" w:line="480"/>
+        <w:spacing w:after="80" w:before="160" w:line="276"/>
       </w:pPr>
       <w:r>
         <w:rPr>
@@ -1557,8 +1542,7 @@
     <w:p>
       <w:pPr>
         <w:keepNext/>
-        <w:spacing w:after="0" w:before="0" w:line="480"/>
-        <w:ind w:firstLine="360"/>
+        <w:spacing w:after="120" w:before="0" w:line="276"/>
         <w:jc w:val="both"/>
       </w:pPr>
       <w:r>
@@ -1738,7 +1722,7 @@
           <w:tab w:val="center" w:pos="4680"/>
           <w:tab w:val="right" w:pos="9360"/>
         </w:tabs>
-        <w:spacing w:after="160" w:before="160" w:line="240" w:lineRule="auto"/>
+        <w:spacing w:after="120" w:before="40" w:line="240" w:lineRule="auto"/>
       </w:pPr>
       <w:r>
         <w:rPr>
@@ -1986,7 +1970,7 @@
           <w:tab w:val="center" w:pos="4680"/>
           <w:tab w:val="right" w:pos="9360"/>
         </w:tabs>
-        <w:spacing w:after="160" w:before="160" w:line="240" w:lineRule="auto"/>
+        <w:spacing w:after="120" w:before="40" w:line="240" w:lineRule="auto"/>
       </w:pPr>
       <w:r>
         <w:rPr>
@@ -2197,7 +2181,7 @@
           <w:top w:val="single" w:color="000000" w:sz="6" w:space="2"/>
           <w:bottom w:val="single" w:color="000000" w:sz="6" w:space="2"/>
         </w:pBdr>
-        <w:spacing w:after="0" w:before="160" w:line="300"/>
+        <w:spacing w:after="0" w:before="160" w:line="252"/>
       </w:pPr>
       <w:r>
         <w:rPr>
@@ -2222,7 +2206,7 @@
       <w:pPr>
         <w:keepNext/>
         <w:keepLines/>
-        <w:spacing w:after="0" w:before="0" w:line="300"/>
+        <w:spacing w:after="0" w:before="0" w:line="252"/>
       </w:pPr>
       <w:r>
         <w:rPr>
@@ -2391,7 +2375,7 @@
       <w:pPr>
         <w:keepNext/>
         <w:keepLines/>
-        <w:spacing w:after="0" w:before="0" w:line="300"/>
+        <w:spacing w:after="0" w:before="0" w:line="252"/>
       </w:pPr>
       <w:r>
         <w:rPr>
@@ -2461,7 +2445,7 @@
       <w:pPr>
         <w:keepNext/>
         <w:keepLines/>
-        <w:spacing w:after="0" w:before="0" w:line="300"/>
+        <w:spacing w:after="0" w:before="0" w:line="252"/>
       </w:pPr>
       <w:r>
         <w:rPr>
@@ -2503,7 +2487,7 @@
       <w:pPr>
         <w:keepNext/>
         <w:keepLines/>
-        <w:spacing w:after="0" w:before="0" w:line="300"/>
+        <w:spacing w:after="0" w:before="0" w:line="252"/>
       </w:pPr>
       <w:r>
         <w:rPr>
@@ -2599,7 +2583,7 @@
       <w:pPr>
         <w:keepNext/>
         <w:keepLines/>
-        <w:spacing w:after="0" w:before="0" w:line="300"/>
+        <w:spacing w:after="0" w:before="0" w:line="252"/>
       </w:pPr>
       <w:r>
         <w:rPr>
@@ -2704,7 +2688,7 @@
       <w:pPr>
         <w:keepNext/>
         <w:keepLines/>
-        <w:spacing w:after="0" w:before="0" w:line="300"/>
+        <w:spacing w:after="0" w:before="0" w:line="252"/>
       </w:pPr>
       <w:r>
         <w:rPr>
@@ -2737,7 +2721,7 @@
       <w:pPr>
         <w:keepNext/>
         <w:keepLines/>
-        <w:spacing w:after="0" w:before="0" w:line="300"/>
+        <w:spacing w:after="0" w:before="0" w:line="252"/>
       </w:pPr>
       <w:r>
         <w:rPr>
@@ -2755,7 +2739,7 @@
         <w:pBdr>
           <w:bottom w:val="single" w:color="000000" w:sz="6" w:space="2"/>
         </w:pBdr>
-        <w:spacing w:after="200" w:before="0" w:line="300"/>
+        <w:spacing w:after="200" w:before="0" w:line="252"/>
       </w:pPr>
       <w:r>
         <w:rPr>
@@ -2842,7 +2826,7 @@
       <w:pPr>
         <w:pStyle w:val="Heading1"/>
         <w:keepNext/>
-        <w:spacing w:after="0" w:before="240" w:line="480"/>
+        <w:spacing w:after="80" w:before="240" w:line="276"/>
       </w:pPr>
       <w:r>
         <w:rPr>
@@ -2860,8 +2844,7 @@
     <w:p>
       <w:pPr>
         <w:keepNext w:val="false"/>
-        <w:spacing w:after="0" w:before="0" w:line="480"/>
-        <w:ind w:firstLine="360"/>
+        <w:spacing w:after="120" w:before="0" w:line="276"/>
         <w:jc w:val="both"/>
       </w:pPr>
       <w:r>
@@ -2886,8 +2869,7 @@
     <w:p>
       <w:pPr>
         <w:keepNext w:val="false"/>
-        <w:spacing w:after="0" w:before="0" w:line="480"/>
-        <w:ind w:firstLine="360"/>
+        <w:spacing w:after="120" w:before="0" w:line="276"/>
         <w:jc w:val="both"/>
       </w:pPr>
       <w:r>
@@ -3020,8 +3002,7 @@
     <w:p>
       <w:pPr>
         <w:keepNext w:val="false"/>
-        <w:spacing w:after="0" w:before="0" w:line="480"/>
-        <w:ind w:firstLine="360"/>
+        <w:spacing w:after="120" w:before="0" w:line="276"/>
         <w:jc w:val="both"/>
       </w:pPr>
       <w:r>
@@ -3064,8 +3045,7 @@
     <w:p>
       <w:pPr>
         <w:keepNext/>
-        <w:spacing w:after="0" w:before="0" w:line="480"/>
-        <w:ind w:firstLine="360"/>
+        <w:spacing w:after="120" w:before="0" w:line="276"/>
         <w:jc w:val="both"/>
       </w:pPr>
       <w:r>
@@ -3165,7 +3145,7 @@
           <w:tab w:val="center" w:pos="4680"/>
           <w:tab w:val="right" w:pos="9360"/>
         </w:tabs>
-        <w:spacing w:after="160" w:before="160" w:line="240" w:lineRule="auto"/>
+        <w:spacing w:after="120" w:before="40" w:line="240" w:lineRule="auto"/>
       </w:pPr>
       <w:r>
         <w:rPr>
@@ -3282,7 +3262,7 @@
     <w:p>
       <w:pPr>
         <w:keepNext w:val="false"/>
-        <w:spacing w:after="0" w:before="0" w:line="480"/>
+        <w:spacing w:after="120" w:before="0" w:line="276"/>
         <w:jc w:val="both"/>
       </w:pPr>
       <w:r>
@@ -3457,7 +3437,7 @@
       <w:pPr>
         <w:pStyle w:val="Heading1"/>
         <w:keepNext/>
-        <w:spacing w:after="0" w:before="240" w:line="480"/>
+        <w:spacing w:after="80" w:before="240" w:line="276"/>
       </w:pPr>
       <w:r>
         <w:rPr>
@@ -3476,7 +3456,7 @@
       <w:pPr>
         <w:pStyle w:val="Heading2"/>
         <w:keepNext/>
-        <w:spacing w:after="0" w:before="120" w:line="480"/>
+        <w:spacing w:after="80" w:before="160" w:line="276"/>
       </w:pPr>
       <w:r>
         <w:rPr>
@@ -3494,8 +3474,7 @@
     <w:p>
       <w:pPr>
         <w:keepNext w:val="false"/>
-        <w:spacing w:after="0" w:before="0" w:line="480"/>
-        <w:ind w:firstLine="360"/>
+        <w:spacing w:after="120" w:before="0" w:line="276"/>
         <w:jc w:val="both"/>
       </w:pPr>
       <w:r>
@@ -3546,7 +3525,7 @@
     <w:p>
       <w:pPr>
         <w:keepNext/>
-        <w:spacing w:after="60" w:before="120" w:line="360"/>
+        <w:spacing w:after="60" w:before="120" w:line="252"/>
         <w:jc w:val="left"/>
       </w:pPr>
       <w:r>
@@ -5052,7 +5031,7 @@
       <w:pPr>
         <w:pStyle w:val="Heading2"/>
         <w:keepNext/>
-        <w:spacing w:after="0" w:before="120" w:line="480"/>
+        <w:spacing w:after="80" w:before="160" w:line="276"/>
       </w:pPr>
       <w:r>
         <w:rPr>
@@ -5070,8 +5049,7 @@
     <w:p>
       <w:pPr>
         <w:keepNext w:val="false"/>
-        <w:spacing w:after="0" w:before="0" w:line="480"/>
-        <w:ind w:firstLine="360"/>
+        <w:spacing w:after="120" w:before="0" w:line="276"/>
         <w:jc w:val="both"/>
       </w:pPr>
       <w:r>
@@ -5104,7 +5082,7 @@
     <w:p>
       <w:pPr>
         <w:keepNext/>
-        <w:spacing w:after="60" w:before="120" w:line="360"/>
+        <w:spacing w:after="60" w:before="120" w:line="252"/>
         <w:jc w:val="left"/>
       </w:pPr>
       <w:r>
@@ -7250,7 +7228,7 @@
     <w:p>
       <w:pPr>
         <w:keepNext w:val="false"/>
-        <w:spacing w:after="200" w:before="120" w:line="360"/>
+        <w:spacing w:after="200" w:before="120" w:line="252"/>
         <w:jc w:val="left"/>
       </w:pPr>
       <w:r>
@@ -7275,8 +7253,7 @@
     <w:p>
       <w:pPr>
         <w:keepNext w:val="false"/>
-        <w:spacing w:after="0" w:before="0" w:line="480"/>
-        <w:ind w:firstLine="360"/>
+        <w:spacing w:after="120" w:before="0" w:line="276"/>
         <w:jc w:val="both"/>
       </w:pPr>
       <w:r>
@@ -7345,8 +7322,7 @@
     <w:p>
       <w:pPr>
         <w:keepNext w:val="false"/>
-        <w:spacing w:after="0" w:before="0" w:line="480"/>
-        <w:ind w:firstLine="360"/>
+        <w:spacing w:after="120" w:before="0" w:line="276"/>
         <w:jc w:val="both"/>
       </w:pPr>
       <w:r>
@@ -7462,7 +7438,7 @@
     <w:p>
       <w:pPr>
         <w:keepNext w:val="false"/>
-        <w:spacing w:after="200" w:before="120" w:line="360"/>
+        <w:spacing w:after="200" w:before="120" w:line="252"/>
         <w:jc w:val="left"/>
       </w:pPr>
       <w:r>
@@ -7488,7 +7464,7 @@
       <w:pPr>
         <w:pStyle w:val="Heading2"/>
         <w:keepNext/>
-        <w:spacing w:after="0" w:before="120" w:line="480"/>
+        <w:spacing w:after="80" w:before="160" w:line="276"/>
       </w:pPr>
       <w:r>
         <w:rPr>
@@ -7506,8 +7482,7 @@
     <w:p>
       <w:pPr>
         <w:keepNext w:val="false"/>
-        <w:spacing w:after="0" w:before="0" w:line="480"/>
-        <w:ind w:firstLine="360"/>
+        <w:spacing w:after="120" w:before="0" w:line="276"/>
         <w:jc w:val="both"/>
       </w:pPr>
       <w:r>
@@ -7523,7 +7498,7 @@
       <w:pPr>
         <w:pStyle w:val="Heading1"/>
         <w:keepNext/>
-        <w:spacing w:after="0" w:before="240" w:line="480"/>
+        <w:spacing w:after="80" w:before="240" w:line="276"/>
       </w:pPr>
       <w:r>
         <w:rPr>
@@ -7541,8 +7516,7 @@
     <w:p>
       <w:pPr>
         <w:keepNext w:val="false"/>
-        <w:spacing w:after="0" w:before="0" w:line="480"/>
-        <w:ind w:firstLine="360"/>
+        <w:spacing w:after="120" w:before="0" w:line="276"/>
         <w:jc w:val="both"/>
       </w:pPr>
       <w:r>
@@ -7558,7 +7532,7 @@
       <w:pPr>
         <w:pStyle w:val="Heading1"/>
         <w:keepNext/>
-        <w:spacing w:after="0" w:before="240" w:line="480"/>
+        <w:spacing w:after="80" w:before="240" w:line="276"/>
       </w:pPr>
       <w:r>
         <w:rPr>
@@ -7576,8 +7550,7 @@
     <w:p>
       <w:pPr>
         <w:keepNext w:val="false"/>
-        <w:spacing w:after="0" w:before="0" w:line="480"/>
-        <w:ind w:firstLine="360"/>
+        <w:spacing w:after="120" w:before="0" w:line="276"/>
         <w:jc w:val="both"/>
       </w:pPr>
       <w:r>
@@ -7593,7 +7566,7 @@
       <w:pPr>
         <w:pStyle w:val="Heading1"/>
         <w:keepNext/>
-        <w:spacing w:after="0" w:before="240" w:line="480"/>
+        <w:spacing w:after="80" w:before="240" w:line="276"/>
       </w:pPr>
       <w:r>
         <w:rPr>
@@ -7611,8 +7584,8 @@
     <w:p>
       <w:pPr>
         <w:keepNext w:val="false"/>
-        <w:spacing w:after="0" w:before="0" w:line="480"/>
-        <w:jc w:val="both"/>
+        <w:spacing w:after="120" w:before="0" w:line="276"/>
+        <w:jc w:val="left"/>
       </w:pPr>
       <w:r>
         <w:rPr>
@@ -7627,7 +7600,7 @@
       <w:pPr>
         <w:pStyle w:val="Heading1"/>
         <w:keepNext/>
-        <w:spacing w:after="0" w:before="240" w:line="480"/>
+        <w:spacing w:after="80" w:before="240" w:line="276"/>
       </w:pPr>
       <w:r>
         <w:rPr>
@@ -7645,7 +7618,7 @@
     <w:p>
       <w:pPr>
         <w:keepNext w:val="false"/>
-        <w:spacing w:after="0" w:before="0" w:line="480"/>
+        <w:spacing w:after="120" w:before="0" w:line="276"/>
         <w:jc w:val="both"/>
       </w:pPr>
       <w:r>
@@ -7671,7 +7644,7 @@
       <w:pPr>
         <w:pStyle w:val="Heading1"/>
         <w:keepNext/>
-        <w:spacing w:after="0" w:before="240" w:line="480"/>
+        <w:spacing w:after="80" w:before="240" w:line="276"/>
       </w:pPr>
       <w:r>
         <w:rPr>
@@ -7689,7 +7662,7 @@
     <w:p>
       <w:pPr>
         <w:keepNext w:val="false"/>
-        <w:spacing w:after="0" w:before="0" w:line="480"/>
+        <w:spacing w:after="120" w:before="0" w:line="276"/>
         <w:jc w:val="both"/>
       </w:pPr>
       <w:r>
@@ -7705,7 +7678,7 @@
       <w:pPr>
         <w:pStyle w:val="Heading1"/>
         <w:keepNext/>
-        <w:spacing w:after="0" w:before="240" w:line="480"/>
+        <w:spacing w:after="80" w:before="240" w:line="276"/>
       </w:pPr>
       <w:r>
         <w:rPr>
@@ -7723,7 +7696,7 @@
     <w:p>
       <w:pPr>
         <w:keepNext w:val="false"/>
-        <w:spacing w:after="0" w:before="0" w:line="480"/>
+        <w:spacing w:after="120" w:before="0" w:line="276"/>
         <w:jc w:val="both"/>
       </w:pPr>
       <w:r>
@@ -7739,7 +7712,7 @@
       <w:pPr>
         <w:pStyle w:val="Heading1"/>
         <w:keepNext/>
-        <w:spacing w:after="0" w:before="240" w:line="480"/>
+        <w:spacing w:after="80" w:before="240" w:line="276"/>
       </w:pPr>
       <w:r>
         <w:rPr>
@@ -7757,7 +7730,7 @@
     <w:p>
       <w:pPr>
         <w:keepNext w:val="false"/>
-        <w:spacing w:after="0" w:before="0" w:line="480"/>
+        <w:spacing w:after="120" w:before="0" w:line="276"/>
         <w:jc w:val="both"/>
       </w:pPr>
       <w:r>
@@ -7773,7 +7746,7 @@
       <w:pPr>
         <w:pStyle w:val="Heading1"/>
         <w:keepNext/>
-        <w:spacing w:after="0" w:before="240" w:line="480"/>
+        <w:spacing w:after="80" w:before="240" w:line="276"/>
       </w:pPr>
       <w:r>
         <w:rPr>
@@ -7790,7 +7763,7 @@
     </w:p>
     <w:p>
       <w:pPr>
-        <w:spacing w:after="0" w:line="480"/>
+        <w:spacing w:after="80" w:line="240"/>
         <w:ind w:left="480" w:hanging="480"/>
         <w:jc w:val="left"/>
       </w:pPr>
@@ -7805,7 +7778,7 @@
     </w:p>
     <w:p>
       <w:pPr>
-        <w:spacing w:after="0" w:line="480"/>
+        <w:spacing w:after="80" w:line="240"/>
         <w:ind w:left="480" w:hanging="480"/>
         <w:jc w:val="left"/>
       </w:pPr>
@@ -7820,7 +7793,7 @@
     </w:p>
     <w:p>
       <w:pPr>
-        <w:spacing w:after="0" w:line="480"/>
+        <w:spacing w:after="80" w:line="240"/>
         <w:ind w:left="480" w:hanging="480"/>
         <w:jc w:val="left"/>
       </w:pPr>
@@ -7835,7 +7808,7 @@
     </w:p>
     <w:p>
       <w:pPr>
-        <w:spacing w:after="0" w:line="480"/>
+        <w:spacing w:after="80" w:line="240"/>
         <w:ind w:left="480" w:hanging="480"/>
         <w:jc w:val="left"/>
       </w:pPr>
@@ -7850,7 +7823,7 @@
     </w:p>
     <w:p>
       <w:pPr>
-        <w:spacing w:after="0" w:line="480"/>
+        <w:spacing w:after="80" w:line="240"/>
         <w:ind w:left="480" w:hanging="480"/>
         <w:jc w:val="left"/>
       </w:pPr>
@@ -7865,7 +7838,7 @@
     </w:p>
     <w:p>
       <w:pPr>
-        <w:spacing w:after="0" w:line="480"/>
+        <w:spacing w:after="80" w:line="240"/>
         <w:ind w:left="480" w:hanging="480"/>
         <w:jc w:val="left"/>
       </w:pPr>
@@ -7880,7 +7853,7 @@
     </w:p>
     <w:p>
       <w:pPr>
-        <w:spacing w:after="0" w:line="480"/>
+        <w:spacing w:after="80" w:line="240"/>
         <w:ind w:left="480" w:hanging="480"/>
         <w:jc w:val="left"/>
       </w:pPr>
@@ -7895,7 +7868,7 @@
     </w:p>
     <w:p>
       <w:pPr>
-        <w:spacing w:after="0" w:line="480"/>
+        <w:spacing w:after="80" w:line="240"/>
         <w:ind w:left="480" w:hanging="480"/>
         <w:jc w:val="left"/>
       </w:pPr>
@@ -7910,7 +7883,7 @@
     </w:p>
     <w:p>
       <w:pPr>
-        <w:spacing w:after="0" w:line="480"/>
+        <w:spacing w:after="80" w:line="240"/>
         <w:ind w:left="480" w:hanging="480"/>
         <w:jc w:val="left"/>
       </w:pPr>
@@ -7925,7 +7898,7 @@
     </w:p>
     <w:p>
       <w:pPr>
-        <w:spacing w:after="0" w:line="480"/>
+        <w:spacing w:after="80" w:line="240"/>
         <w:ind w:left="480" w:hanging="480"/>
         <w:jc w:val="left"/>
       </w:pPr>
@@ -7940,7 +7913,7 @@
     </w:p>
     <w:p>
       <w:pPr>
-        <w:spacing w:after="0" w:line="480"/>
+        <w:spacing w:after="80" w:line="240"/>
         <w:ind w:left="480" w:hanging="480"/>
         <w:jc w:val="left"/>
       </w:pPr>
@@ -7955,7 +7928,7 @@
     </w:p>
     <w:p>
       <w:pPr>
-        <w:spacing w:after="0" w:line="480"/>
+        <w:spacing w:after="80" w:line="240"/>
         <w:ind w:left="480" w:hanging="480"/>
         <w:jc w:val="left"/>
       </w:pPr>
@@ -7970,7 +7943,7 @@
     </w:p>
     <w:p>
       <w:pPr>
-        <w:spacing w:after="0" w:line="480"/>
+        <w:spacing w:after="80" w:line="240"/>
         <w:ind w:left="480" w:hanging="480"/>
         <w:jc w:val="left"/>
       </w:pPr>
@@ -7985,7 +7958,7 @@
     </w:p>
     <w:p>
       <w:pPr>
-        <w:spacing w:after="0" w:line="480"/>
+        <w:spacing w:after="80" w:line="240"/>
         <w:ind w:left="480" w:hanging="480"/>
         <w:jc w:val="left"/>
       </w:pPr>
@@ -8000,7 +7973,7 @@
     </w:p>
     <w:p>
       <w:pPr>
-        <w:spacing w:after="0" w:line="480"/>
+        <w:spacing w:after="80" w:line="240"/>
         <w:ind w:left="480" w:hanging="480"/>
         <w:jc w:val="left"/>
       </w:pPr>
@@ -8015,7 +7988,7 @@
     </w:p>
     <w:p>
       <w:pPr>
-        <w:spacing w:after="0" w:line="480"/>
+        <w:spacing w:after="80" w:line="240"/>
         <w:ind w:left="480" w:hanging="480"/>
         <w:jc w:val="left"/>
       </w:pPr>
@@ -8030,7 +8003,7 @@
     </w:p>
     <w:p>
       <w:pPr>
-        <w:spacing w:after="0" w:line="480"/>
+        <w:spacing w:after="80" w:line="240"/>
         <w:ind w:left="480" w:hanging="480"/>
         <w:jc w:val="left"/>
       </w:pPr>
@@ -8045,7 +8018,7 @@
     </w:p>
     <w:p>
       <w:pPr>
-        <w:spacing w:after="0" w:line="480"/>
+        <w:spacing w:after="80" w:line="240"/>
         <w:ind w:left="480" w:hanging="480"/>
         <w:jc w:val="left"/>
       </w:pPr>
@@ -8060,7 +8033,7 @@
     </w:p>
     <w:p>
       <w:pPr>
-        <w:spacing w:after="0" w:line="480"/>
+        <w:spacing w:after="80" w:line="240"/>
         <w:ind w:left="480" w:hanging="480"/>
         <w:jc w:val="left"/>
       </w:pPr>
@@ -8075,7 +8048,7 @@
     </w:p>
     <w:p>
       <w:pPr>
-        <w:spacing w:after="0" w:line="480"/>
+        <w:spacing w:after="80" w:line="240"/>
         <w:ind w:left="480" w:hanging="480"/>
         <w:jc w:val="left"/>
       </w:pPr>
@@ -8090,7 +8063,7 @@
     </w:p>
     <w:p>
       <w:pPr>
-        <w:spacing w:after="0" w:line="480"/>
+        <w:spacing w:after="80" w:line="240"/>
         <w:ind w:left="480" w:hanging="480"/>
         <w:jc w:val="left"/>
       </w:pPr>
@@ -8105,7 +8078,7 @@
     </w:p>
     <w:p>
       <w:pPr>
-        <w:spacing w:after="0" w:line="480"/>
+        <w:spacing w:after="80" w:line="240"/>
         <w:ind w:left="480" w:hanging="480"/>
         <w:jc w:val="left"/>
       </w:pPr>
@@ -8120,7 +8093,7 @@
     </w:p>
     <w:p>
       <w:pPr>
-        <w:spacing w:after="0" w:line="480"/>
+        <w:spacing w:after="80" w:line="240"/>
         <w:ind w:left="480" w:hanging="480"/>
         <w:jc w:val="left"/>
       </w:pPr>
@@ -8135,7 +8108,7 @@
     </w:p>
     <w:p>
       <w:pPr>
-        <w:spacing w:after="0" w:line="480"/>
+        <w:spacing w:after="80" w:line="240"/>
         <w:ind w:left="480" w:hanging="480"/>
         <w:jc w:val="left"/>
       </w:pPr>
@@ -8150,7 +8123,7 @@
     </w:p>
     <w:p>
       <w:pPr>
-        <w:spacing w:after="0" w:line="480"/>
+        <w:spacing w:after="80" w:line="240"/>
         <w:ind w:left="480" w:hanging="480"/>
         <w:jc w:val="left"/>
       </w:pPr>
@@ -8165,7 +8138,7 @@
     </w:p>
     <w:p>
       <w:pPr>
-        <w:spacing w:after="0" w:line="480"/>
+        <w:spacing w:after="80" w:line="240"/>
         <w:ind w:left="480" w:hanging="480"/>
         <w:jc w:val="left"/>
       </w:pPr>
@@ -8180,7 +8153,7 @@
     </w:p>
     <w:p>
       <w:pPr>
-        <w:spacing w:after="0" w:line="480"/>
+        <w:spacing w:after="80" w:line="240"/>
         <w:ind w:left="480" w:hanging="480"/>
         <w:jc w:val="left"/>
       </w:pPr>
@@ -8195,7 +8168,7 @@
     </w:p>
     <w:p>
       <w:pPr>
-        <w:spacing w:after="0" w:line="480"/>
+        <w:spacing w:after="80" w:line="240"/>
         <w:ind w:left="480" w:hanging="480"/>
         <w:jc w:val="left"/>
       </w:pPr>
@@ -8210,7 +8183,7 @@
     </w:p>
     <w:p>
       <w:pPr>
-        <w:spacing w:after="0" w:line="480"/>
+        <w:spacing w:after="80" w:line="240"/>
         <w:ind w:left="480" w:hanging="480"/>
         <w:jc w:val="left"/>
       </w:pPr>
@@ -8225,7 +8198,7 @@
     </w:p>
     <w:p>
       <w:pPr>
-        <w:spacing w:after="0" w:line="480"/>
+        <w:spacing w:after="80" w:line="240"/>
         <w:ind w:left="480" w:hanging="480"/>
         <w:jc w:val="left"/>
       </w:pPr>
@@ -8240,7 +8213,7 @@
     </w:p>
     <w:p>
       <w:pPr>
-        <w:spacing w:after="0" w:line="480"/>
+        <w:spacing w:after="80" w:line="240"/>
         <w:ind w:left="480" w:hanging="480"/>
         <w:jc w:val="left"/>
       </w:pPr>
@@ -8255,7 +8228,7 @@
     </w:p>
     <w:p>
       <w:pPr>
-        <w:spacing w:after="0" w:line="480"/>
+        <w:spacing w:after="80" w:line="240"/>
         <w:ind w:left="480" w:hanging="480"/>
         <w:jc w:val="left"/>
       </w:pPr>
@@ -8270,7 +8243,7 @@
     </w:p>
     <w:p>
       <w:pPr>
-        <w:spacing w:after="0" w:line="480"/>
+        <w:spacing w:after="80" w:line="240"/>
         <w:ind w:left="480" w:hanging="480"/>
         <w:jc w:val="left"/>
       </w:pPr>
@@ -8285,7 +8258,7 @@
     </w:p>
     <w:p>
       <w:pPr>
-        <w:spacing w:after="0" w:line="480"/>
+        <w:spacing w:after="80" w:line="240"/>
         <w:ind w:left="480" w:hanging="480"/>
         <w:jc w:val="left"/>
       </w:pPr>
@@ -8300,7 +8273,7 @@
     </w:p>
     <w:p>
       <w:pPr>
-        <w:spacing w:after="0" w:line="480"/>
+        <w:spacing w:after="80" w:line="240"/>
         <w:ind w:left="480" w:hanging="480"/>
         <w:jc w:val="left"/>
       </w:pPr>
@@ -8315,7 +8288,7 @@
     </w:p>
     <w:p>
       <w:pPr>
-        <w:spacing w:after="0" w:line="480"/>
+        <w:spacing w:after="80" w:line="240"/>
         <w:ind w:left="480" w:hanging="480"/>
         <w:jc w:val="left"/>
       </w:pPr>
@@ -8332,7 +8305,6 @@
       <w:footerReference w:type="default" r:id="rId6"/>
       <w:pgSz w:w="12240" w:h="15840" w:orient="portrait"/>
       <w:pgMar w:top="1440" w:right="1440" w:bottom="1440" w:left="1440" w:header="708" w:footer="708" w:gutter="0"/>
-      <w:lnNumType w:countBy="1" w:restart="continuous"/>
       <w:pgNumType/>
       <w:docGrid w:linePitch="360"/>
     </w:sectPr>
@@ -8542,7 +8514,7 @@
     </w:rPrDefault>
     <w:pPrDefault>
       <w:pPr>
-        <w:spacing w:line="480"/>
+        <w:spacing w:line="276"/>
       </w:pPr>
     </w:pPrDefault>
   </w:docDefaults>
@@ -8705,7 +8677,7 @@
     <w:next w:val="Normal"/>
     <w:qFormat/>
     <w:pPr>
-      <w:spacing w:after="0" w:before="240" w:line="480"/>
+      <w:spacing w:after="80" w:before="240" w:line="276"/>
       <w:outlineLvl w:val="0"/>
     </w:pPr>
     <w:rPr>
@@ -8722,7 +8694,7 @@
     <w:next w:val="Normal"/>
     <w:qFormat/>
     <w:pPr>
-      <w:spacing w:after="0" w:before="120" w:line="480"/>
+      <w:spacing w:after="80" w:before="160" w:line="276"/>
       <w:outlineLvl w:val="1"/>
     </w:pPr>
     <w:rPr>

</xml_diff>